<commit_message>
UD1_Act2_Cierre de actividad 2_practicas iniciales para proyectos en Github.
</commit_message>
<xml_diff>
--- a/UD1/ACT.2/UD1_ACT2_Francella Rojas Castillo.docx
+++ b/UD1/ACT.2/UD1_ACT2_Francella Rojas Castillo.docx
@@ -76,7 +76,7 @@
         <mc:AlternateContent>
           <mc:Choice Requires="wpg">
             <w:drawing>
-              <wp:anchor distT="0" distB="0" distL="114300" distR="114300" simplePos="0" relativeHeight="251675648" behindDoc="0" locked="0" layoutInCell="1" allowOverlap="1" wp14:anchorId="0527BDAE" wp14:editId="137282AF">
+              <wp:anchor distT="0" distB="0" distL="114300" distR="114300" simplePos="0" relativeHeight="251675648" behindDoc="0" locked="0" layoutInCell="1" allowOverlap="1" wp14:anchorId="0527BDAE" wp14:editId="44F117F5">
                 <wp:simplePos x="0" y="0"/>
                 <wp:positionH relativeFrom="column">
                   <wp:posOffset>-1333500</wp:posOffset>
@@ -1030,7 +1030,7 @@
           <w:noProof/>
         </w:rPr>
         <w:drawing>
-          <wp:anchor distT="0" distB="0" distL="114300" distR="114300" simplePos="0" relativeHeight="251676672" behindDoc="0" locked="0" layoutInCell="1" allowOverlap="1" wp14:anchorId="37DC13FC" wp14:editId="29433C71">
+          <wp:anchor distT="0" distB="0" distL="114300" distR="114300" simplePos="0" relativeHeight="251676672" behindDoc="0" locked="0" layoutInCell="1" allowOverlap="1" wp14:anchorId="37DC13FC" wp14:editId="02F9D1C5">
             <wp:simplePos x="0" y="0"/>
             <wp:positionH relativeFrom="margin">
               <wp:posOffset>80010</wp:posOffset>
@@ -1682,6 +1682,9 @@
         </w:tabs>
       </w:pPr>
       <w:r>
+        <w:rPr>
+          <w:noProof/>
+        </w:rPr>
         <w:drawing>
           <wp:anchor distT="0" distB="0" distL="114300" distR="114300" simplePos="0" relativeHeight="251685888" behindDoc="0" locked="0" layoutInCell="1" allowOverlap="1" wp14:anchorId="0011CBF3" wp14:editId="3C91324B">
             <wp:simplePos x="0" y="0"/>
@@ -1791,7 +1794,7 @@
           <w:noProof/>
         </w:rPr>
         <w:drawing>
-          <wp:anchor distT="0" distB="0" distL="114300" distR="114300" simplePos="0" relativeHeight="251683840" behindDoc="0" locked="0" layoutInCell="1" allowOverlap="1" wp14:anchorId="3C8DD05D" wp14:editId="22AC06E5">
+          <wp:anchor distT="0" distB="0" distL="114300" distR="114300" simplePos="0" relativeHeight="251683840" behindDoc="0" locked="0" layoutInCell="1" allowOverlap="1" wp14:anchorId="3C8DD05D" wp14:editId="6C2C8511">
             <wp:simplePos x="0" y="0"/>
             <wp:positionH relativeFrom="margin">
               <wp:posOffset>-95250</wp:posOffset>
@@ -1865,11 +1868,150 @@
         <w:t>Pasar de "Develop" a "Master o Main"</w:t>
       </w:r>
     </w:p>
-    <w:p/>
+    <w:p>
+      <w:r>
+        <w:rPr>
+          <w:noProof/>
+        </w:rPr>
+        <w:drawing>
+          <wp:inline distT="0" distB="0" distL="0" distR="0" wp14:anchorId="695B8006" wp14:editId="48728386">
+            <wp:extent cx="5612130" cy="1696085"/>
+            <wp:effectExtent l="0" t="0" r="7620" b="0"/>
+            <wp:docPr id="1327746456" name="Imagen 10" descr="Interfaz de usuario gráfica, Texto, Aplicación&#10;&#10;El contenido generado por IA puede ser incorrecto."/>
+            <wp:cNvGraphicFramePr>
+              <a:graphicFrameLocks xmlns:a="http://schemas.openxmlformats.org/drawingml/2006/main" noChangeAspect="1"/>
+            </wp:cNvGraphicFramePr>
+            <a:graphic xmlns:a="http://schemas.openxmlformats.org/drawingml/2006/main">
+              <a:graphicData uri="http://schemas.openxmlformats.org/drawingml/2006/picture">
+                <pic:pic xmlns:pic="http://schemas.openxmlformats.org/drawingml/2006/picture">
+                  <pic:nvPicPr>
+                    <pic:cNvPr id="1327746456" name="Imagen 10" descr="Interfaz de usuario gráfica, Texto, Aplicación&#10;&#10;El contenido generado por IA puede ser incorrecto."/>
+                    <pic:cNvPicPr/>
+                  </pic:nvPicPr>
+                  <pic:blipFill>
+                    <a:blip r:embed="rId26" cstate="print">
+                      <a:extLst>
+                        <a:ext uri="{28A0092B-C50C-407E-A947-70E740481C1C}">
+                          <a14:useLocalDpi xmlns:a14="http://schemas.microsoft.com/office/drawing/2010/main" val="0"/>
+                        </a:ext>
+                      </a:extLst>
+                    </a:blip>
+                    <a:stretch>
+                      <a:fillRect/>
+                    </a:stretch>
+                  </pic:blipFill>
+                  <pic:spPr>
+                    <a:xfrm>
+                      <a:off x="0" y="0"/>
+                      <a:ext cx="5612130" cy="1696085"/>
+                    </a:xfrm>
+                    <a:prstGeom prst="rect">
+                      <a:avLst/>
+                    </a:prstGeom>
+                  </pic:spPr>
+                </pic:pic>
+              </a:graphicData>
+            </a:graphic>
+          </wp:inline>
+        </w:drawing>
+      </w:r>
+      <w:r>
+        <w:rPr>
+          <w:noProof/>
+        </w:rPr>
+        <w:drawing>
+          <wp:inline distT="0" distB="0" distL="0" distR="0" wp14:anchorId="0A1CE855" wp14:editId="2D528E51">
+            <wp:extent cx="5612130" cy="2067560"/>
+            <wp:effectExtent l="0" t="0" r="7620" b="8890"/>
+            <wp:docPr id="136260763" name="Imagen 11" descr="Interfaz de usuario gráfica, Texto, Aplicación, Correo electrónico&#10;&#10;El contenido generado por IA puede ser incorrecto."/>
+            <wp:cNvGraphicFramePr>
+              <a:graphicFrameLocks xmlns:a="http://schemas.openxmlformats.org/drawingml/2006/main" noChangeAspect="1"/>
+            </wp:cNvGraphicFramePr>
+            <a:graphic xmlns:a="http://schemas.openxmlformats.org/drawingml/2006/main">
+              <a:graphicData uri="http://schemas.openxmlformats.org/drawingml/2006/picture">
+                <pic:pic xmlns:pic="http://schemas.openxmlformats.org/drawingml/2006/picture">
+                  <pic:nvPicPr>
+                    <pic:cNvPr id="136260763" name="Imagen 11" descr="Interfaz de usuario gráfica, Texto, Aplicación, Correo electrónico&#10;&#10;El contenido generado por IA puede ser incorrecto."/>
+                    <pic:cNvPicPr/>
+                  </pic:nvPicPr>
+                  <pic:blipFill>
+                    <a:blip r:embed="rId27">
+                      <a:extLst>
+                        <a:ext uri="{28A0092B-C50C-407E-A947-70E740481C1C}">
+                          <a14:useLocalDpi xmlns:a14="http://schemas.microsoft.com/office/drawing/2010/main" val="0"/>
+                        </a:ext>
+                      </a:extLst>
+                    </a:blip>
+                    <a:stretch>
+                      <a:fillRect/>
+                    </a:stretch>
+                  </pic:blipFill>
+                  <pic:spPr>
+                    <a:xfrm>
+                      <a:off x="0" y="0"/>
+                      <a:ext cx="5612130" cy="2067560"/>
+                    </a:xfrm>
+                    <a:prstGeom prst="rect">
+                      <a:avLst/>
+                    </a:prstGeom>
+                  </pic:spPr>
+                </pic:pic>
+              </a:graphicData>
+            </a:graphic>
+          </wp:inline>
+        </w:drawing>
+      </w:r>
+      <w:r>
+        <w:rPr>
+          <w:noProof/>
+        </w:rPr>
+        <w:drawing>
+          <wp:inline distT="0" distB="0" distL="0" distR="0" wp14:anchorId="562F85CE" wp14:editId="376568CE">
+            <wp:extent cx="5612130" cy="1952625"/>
+            <wp:effectExtent l="0" t="0" r="7620" b="9525"/>
+            <wp:docPr id="782666020" name="Imagen 12" descr="Interfaz de usuario gráfica, Texto, Aplicación, Correo electrónico&#10;&#10;El contenido generado por IA puede ser incorrecto."/>
+            <wp:cNvGraphicFramePr>
+              <a:graphicFrameLocks xmlns:a="http://schemas.openxmlformats.org/drawingml/2006/main" noChangeAspect="1"/>
+            </wp:cNvGraphicFramePr>
+            <a:graphic xmlns:a="http://schemas.openxmlformats.org/drawingml/2006/main">
+              <a:graphicData uri="http://schemas.openxmlformats.org/drawingml/2006/picture">
+                <pic:pic xmlns:pic="http://schemas.openxmlformats.org/drawingml/2006/picture">
+                  <pic:nvPicPr>
+                    <pic:cNvPr id="782666020" name="Imagen 12" descr="Interfaz de usuario gráfica, Texto, Aplicación, Correo electrónico&#10;&#10;El contenido generado por IA puede ser incorrecto."/>
+                    <pic:cNvPicPr/>
+                  </pic:nvPicPr>
+                  <pic:blipFill>
+                    <a:blip r:embed="rId28" cstate="print">
+                      <a:extLst>
+                        <a:ext uri="{28A0092B-C50C-407E-A947-70E740481C1C}">
+                          <a14:useLocalDpi xmlns:a14="http://schemas.microsoft.com/office/drawing/2010/main" val="0"/>
+                        </a:ext>
+                      </a:extLst>
+                    </a:blip>
+                    <a:stretch>
+                      <a:fillRect/>
+                    </a:stretch>
+                  </pic:blipFill>
+                  <pic:spPr>
+                    <a:xfrm>
+                      <a:off x="0" y="0"/>
+                      <a:ext cx="5612130" cy="1952625"/>
+                    </a:xfrm>
+                    <a:prstGeom prst="rect">
+                      <a:avLst/>
+                    </a:prstGeom>
+                  </pic:spPr>
+                </pic:pic>
+              </a:graphicData>
+            </a:graphic>
+          </wp:inline>
+        </w:drawing>
+      </w:r>
+    </w:p>
     <w:p/>
     <w:p/>
     <w:sectPr>
-      <w:footerReference w:type="default" r:id="rId26"/>
+      <w:footerReference w:type="default" r:id="rId29"/>
       <w:pgSz w:w="12240" w:h="15840"/>
       <w:pgMar w:top="1417" w:right="1701" w:bottom="1417" w:left="1701" w:header="708" w:footer="708" w:gutter="0"/>
       <w:cols w:space="708"/>

</xml_diff>